<commit_message>
Phase 10: Complete landowner deal structuring guide, competitive pricing matrix, and competitor PE structures comparison
</commit_message>
<xml_diff>
--- a/10_Outreach_&_Relationship_Banking/26_USACE_Field_Audit_&_Coastal_Oyster_Coalition_Partnership.docx
+++ b/10_Outreach_&_Relationship_Banking/26_USACE_Field_Audit_&_Coastal_Oyster_Coalition_Partnership.docx
@@ -641,67 +641,6 @@
     </w:p>
     <w:p>
       <w:pPr>
-        <w:spacing w:before="240" w:after="80"/>
-      </w:pPr>
-      <w:r>
-        <w:rPr>
-          <w:b/>
-          <w:color w:val="595959"/>
-          <w:sz w:val="26"/>
-        </w:rPr>
-        <w:t>2. Joint B2B Co-Marketing &amp; PR Strategy</w:t>
-      </w:r>
-    </w:p>
-    <w:p>
-      <w:pPr>
-        <w:pStyle w:val="ListBullet"/>
-        <w:spacing w:after="60"/>
-      </w:pPr>
-      <w:r/>
-      <w:r>
-        <w:rPr>
-          <w:b/>
-        </w:rPr>
-        <w:t>Statewide Watershed PR Campaign</w:t>
-      </w:r>
-      <w:r>
-        <w:t>: Launch a joint digital press release titled: *'From Headwaters to Coast: Georgia Restoration Partners Deploy Trout Bioengineering and Living Shorelines to Protect Statewide Waterways.'* Host this case study on both portals with direct crawlable links.</w:t>
-      </w:r>
-    </w:p>
-    <w:p>
-      <w:pPr>
-        <w:pStyle w:val="ListBullet"/>
-        <w:spacing w:after="60"/>
-      </w:pPr>
-      <w:r/>
-      <w:r>
-        <w:rPr>
-          <w:b/>
-        </w:rPr>
-        <w:t>Data Center ESG Target Sheet</w:t>
-      </w:r>
-      <w:r>
-        <w:t>: Distribute a joint ESG impact whitepaper directly to the 15 Georgia Hyperscale Data Centers profiled in File 22. Show that offset purchases from Blue Ridge Stream directly sponsor coastal oyster reclamation materials on Sapelo Island, offering a 2-for-1 environmental return that RES and Corblu cannot match.</w:t>
-      </w:r>
-    </w:p>
-    <w:p>
-      <w:pPr>
-        <w:pStyle w:val="ListBullet"/>
-        <w:spacing w:after="60"/>
-      </w:pPr>
-      <w:r/>
-      <w:r>
-        <w:rPr>
-          <w:b/>
-        </w:rPr>
-        <w:t>Semantic Schema Markup</w:t>
-      </w:r>
-      <w:r>
-        <w:t>: Inject JSON-LD Schema markup on both portals, linking their physical entities (Fluvial Bioengineering Bank vs. Salt Marsh Reef) as associated `ConservationProject` entities, signaling high semantic topical trust to Google Search.</w:t>
-      </w:r>
-    </w:p>
-    <w:p>
-      <w:pPr>
         <w:spacing w:before="120" w:after="120"/>
         <w:ind w:left="360"/>
       </w:pPr>

</xml_diff>